<commit_message>
court(ca11) reply-brief docx: Times New Roman (the typst face, DEF-FONT-002), typeface certificate no longer names LaTeX/EB Garamond; docx check green (fb-595.59)
</commit_message>
<xml_diff>
--- a/courts/eleventh-circuit/court-of-appeals/reply-brief/usage/OUTPUT-reply-brief.docx
+++ b/courts/eleventh-circuit/court-of-appeals/reply-brief/usage/OUTPUT-reply-brief.docx
@@ -694,7 +694,7 @@
         <w:tab/>
       </w:r>
       <w:r>
-        <w:t xml:space="preserve">8</w:t>
+        <w:t xml:space="preserve">9</w:t>
       </w:r>
     </w:p>
     <w:p>
@@ -1082,7 +1082,7 @@
         <w:tab/>
       </w:r>
       <w:r>
-        <w:t xml:space="preserve">*7</w:t>
+        <w:t xml:space="preserve">*7, *8</w:t>
       </w:r>
     </w:p>
     <w:p>
@@ -1176,7 +1176,7 @@
         <w:tab/>
       </w:r>
       <w:r>
-        <w:t xml:space="preserve">*6</w:t>
+        <w:t xml:space="preserve">*6, *7</w:t>
       </w:r>
     </w:p>
     <w:p>
@@ -1408,7 +1408,7 @@
         <w:tab/>
       </w:r>
       <w:r>
-        <w:t xml:space="preserve">*8</w:t>
+        <w:t xml:space="preserve">*9</w:t>
       </w:r>
     </w:p>
     <w:p>
@@ -1516,7 +1516,7 @@
         <w:tab/>
       </w:r>
       <w:r>
-        <w:t xml:space="preserve">4</w:t>
+        <w:t xml:space="preserve">5</w:t>
       </w:r>
     </w:p>
     <w:p>
@@ -1580,7 +1580,7 @@
         <w:tab/>
       </w:r>
       <w:r>
-        <w:t xml:space="preserve">2</w:t>
+        <w:t xml:space="preserve">3</w:t>
       </w:r>
     </w:p>
     <w:p>
@@ -3068,7 +3068,7 @@
         <w:ind w:left="720"/>
       </w:pPr>
       <w:r>
-        <w:t xml:space="preserve">2. This document complies with the typeface requirements of Fed. R. App. P. 32(a)(5) and the type-style requirements of Fed. R. App. P. 32(a)(6) because this document has been prepared in a proportionally spaced typeface using LaTeX in EB Garamond, 14-point font.</w:t>
+        <w:t xml:space="preserve">2. This document complies with the typeface requirements of Fed. R. App. P. 32(a)(5) and the type-style requirements of Fed. R. App. P. 32(a)(6) because this document has been prepared in a proportionally spaced typeface, Times New Roman, in 14-point font.</w:t>
       </w:r>
     </w:p>
     <w:p>
@@ -3794,7 +3794,7 @@
   <w:docDefaults>
     <w:rPrDefault>
       <w:rPr>
-        <w:rFonts w:ascii="EB Garamond" w:hAnsi="EB Garamond" w:eastAsia="EB Garamond" w:cs="EB Garamond"/>
+        <w:rFonts w:ascii="Times New Roman" w:hAnsi="Times New Roman" w:eastAsia="Times New Roman" w:cs="Times New Roman"/>
         <w:sz w:val="28"/>
         <w:szCs w:val="28"/>
         <w:lang w:val="en-US" w:eastAsia="zh-CN" w:bidi="ar-SA"/>

</xml_diff>